<commit_message>
Unify private repository submission instructions
</commit_message>
<xml_diff>
--- a/题目/第一题.docx
+++ b/题目/第一题.docx
@@ -106,13 +106,7 @@
         <w:ind w:left="0" w:right="0" w:firstLine="420" w:firstLineChars="200"/>
       </w:pPr>
       <w:r>
-        <w:rPr>
-          <w:rFonts w:ascii="宋体" w:hAnsi="宋体" w:eastAsia="宋体"/>
-          <w:b w:val="0"/>
-          <w:color w:val="000000"/>
-          <w:sz w:val="21"/>
-        </w:rPr>
-        <w:t>本题全部交付通过GitHub私有仓库完成。招聘方将提供私有仓库或邀请候选人进入指定仓库，具体以招聘通知为准。不得使用公开仓库提交公司招聘题目、题目数据或个人答案。</w:t>
+        <w:t>本题全部交付通过您自己的 GitHub 私有仓库完成。不得使用公开仓库提交公司招聘题目、题目数据或个人答案。请将作答仓库链接发给招聘方，并邀请 GitHub 账号 dldldl888，以便面试官查看。</w:t>
       </w:r>
     </w:p>
     <w:p>
@@ -124,13 +118,7 @@
         <w:ind w:left="0" w:right="0" w:firstLine="420" w:firstLineChars="200"/>
       </w:pPr>
       <w:r>
-        <w:rPr>
-          <w:rFonts w:ascii="宋体" w:hAnsi="宋体" w:eastAsia="宋体"/>
-          <w:b w:val="0"/>
-          <w:color w:val="000000"/>
-          <w:sz w:val="21"/>
-        </w:rPr>
-        <w:t>请将本题要求的全部交付材料提交到仓库，并通过Pull Request提交最终版本；具体材料范围以各题要求为准，本节不增加代码、测试或运行实验任务。请保留反映主要工作过程的提交记录，不得在提交前删除、重写或压缩全部历史。提交完成后提供仓库地址、Pull Request地址及最终提交号。</w:t>
+        <w:t>请将本题要求的全部交付材料提交到您的私有仓库，并将仓库链接发给招聘方；不要向公开题库发起 Pull Request。具体材料范围以各题要求为准，本节不增加代码、测试或运行实验任务。请保留反映主要工作过程的提交记录，不得在提交前删除、重写或压缩全部历史。</w:t>
       </w:r>
     </w:p>
     <w:p>

</xml_diff>